<commit_message>
docs: clarify salary assessment assumptions
</commit_message>
<xml_diff>
--- a/docs/Salary_Management_Draft_Requirements.docx
+++ b/docs/Salary_Management_Draft_Requirements.docx
@@ -5,428 +5,168 @@
     <w:p>
       <w:pPr>
         <w:pStyle w:val="Title"/>
+        <w:widowControl/>
       </w:pPr>
       <w:r>
-        <w:t>Salary Management</w:t>
+        <w:t>Salary Management Requirements</w:t>
       </w:r>
     </w:p>
     <w:p>
       <w:pPr>
-        <w:spacing w:after="240"/>
+        <w:widowControl/>
+        <w:spacing w:after="100"/>
       </w:pPr>
       <w:r>
         <w:rPr>
-          <w:b/>
-          <w:color w:val="556473"/>
-          <w:sz w:val="28"/>
+          <w:i/>
+          <w:color w:val="5A5A5A"/>
+          <w:sz w:val="17"/>
         </w:rPr>
-        <w:t>Draft Requirements</w:t>
-      </w:r>
-    </w:p>
-    <w:tbl>
-      <w:tblPr>
-        <w:tblW w:type="auto" w:w="0"/>
-        <w:jc w:val="left"/>
-        <w:tblLayout w:type="fixed"/>
-        <w:tblLook w:firstColumn="1" w:firstRow="1" w:lastColumn="0" w:lastRow="0" w:noHBand="0" w:noVBand="1" w:val="04A0"/>
-      </w:tblPr>
-      <w:tblGrid>
-        <w:gridCol w:w="1800"/>
-        <w:gridCol w:w="8496"/>
-      </w:tblGrid>
-      <w:tr>
-        <w:tc>
-          <w:tcPr>
-            <w:tcW w:type="dxa" w:w="1800"/>
-            <w:vAlign w:val="center"/>
-            <w:shd w:fill="EAF1F7"/>
-          </w:tcPr>
-          <w:p>
-            <w:pPr>
-              <w:spacing w:after="40"/>
-            </w:pPr>
-            <w:r>
-              <w:rPr>
-                <w:rFonts w:ascii="Aptos" w:hAnsi="Aptos"/>
-                <w:b/>
-                <w:color w:val="1F4E79"/>
-                <w:sz w:val="18"/>
-              </w:rPr>
-              <w:t>Status</w:t>
-            </w:r>
-          </w:p>
-        </w:tc>
-        <w:tc>
-          <w:tcPr>
-            <w:tcW w:type="dxa" w:w="8496"/>
-            <w:vAlign w:val="center"/>
-            <w:shd w:fill="EAF1F7"/>
-          </w:tcPr>
-          <w:p>
-            <w:pPr>
-              <w:spacing w:after="40"/>
-            </w:pPr>
-            <w:r>
-              <w:rPr>
-                <w:rFonts w:ascii="Aptos" w:hAnsi="Aptos"/>
-                <w:sz w:val="18"/>
-              </w:rPr>
-              <w:t>Draft for clarification</w:t>
-            </w:r>
-          </w:p>
-        </w:tc>
-      </w:tr>
-      <w:tr>
-        <w:tc>
-          <w:tcPr>
-            <w:tcW w:type="dxa" w:w="1800"/>
-            <w:vAlign w:val="center"/>
-            <w:shd w:fill="F4F7FA"/>
-          </w:tcPr>
-          <w:p>
-            <w:pPr>
-              <w:spacing w:after="40"/>
-            </w:pPr>
-            <w:r>
-              <w:rPr>
-                <w:rFonts w:ascii="Aptos" w:hAnsi="Aptos"/>
-                <w:b/>
-                <w:color w:val="1F4E79"/>
-                <w:sz w:val="18"/>
-              </w:rPr>
-              <w:t>User</w:t>
-            </w:r>
-          </w:p>
-        </w:tc>
-        <w:tc>
-          <w:tcPr>
-            <w:tcW w:type="dxa" w:w="8496"/>
-            <w:vAlign w:val="center"/>
-            <w:shd w:fill="F4F7FA"/>
-          </w:tcPr>
-          <w:p>
-            <w:pPr>
-              <w:spacing w:after="40"/>
-            </w:pPr>
-            <w:r>
-              <w:rPr>
-                <w:rFonts w:ascii="Aptos" w:hAnsi="Aptos"/>
-                <w:sz w:val="18"/>
-              </w:rPr>
-              <w:t>HR Manager at ACME, an organization with 10,000 employees across multiple countries</w:t>
-            </w:r>
-          </w:p>
-        </w:tc>
-      </w:tr>
-    </w:tbl>
-    <w:p/>
-    <w:p>
-      <w:pPr>
-        <w:pStyle w:val="Heading1"/>
-      </w:pPr>
-      <w:r>
-        <w:t>1. Goal</w:t>
-      </w:r>
-    </w:p>
-    <w:p>
-      <w:r>
-        <w:t>Replace spreadsheet-based salary management with a web application that helps HR maintain employee salary data and answer basic questions about how the organization pays people.</w:t>
+        <w:t>Assumption-based scope for the 10,000-employee assessment</w:t>
       </w:r>
     </w:p>
     <w:p>
       <w:pPr>
         <w:pStyle w:val="Heading1"/>
+        <w:widowControl/>
       </w:pPr>
       <w:r>
-        <w:t>2. Proposed Scope</w:t>
+        <w:t>Goal and user</w:t>
+      </w:r>
+    </w:p>
+    <w:p>
+      <w:pPr>
+        <w:widowControl/>
+      </w:pPr>
+      <w:r>
+        <w:t>Help ACME’s HR Manager replace spreadsheet-based salary tracking with a secure web application for maintaining employee pay and answering common, evidence-based questions about how the organization pays people.</w:t>
+      </w:r>
+    </w:p>
+    <w:p>
+      <w:pPr>
+        <w:pStyle w:val="Heading1"/>
+        <w:widowControl/>
+      </w:pPr>
+      <w:r>
+        <w:t>Assumptions and core scope</w:t>
       </w:r>
     </w:p>
     <w:p>
       <w:pPr>
         <w:pStyle w:val="ListBullet"/>
-        <w:ind w:left="360" w:hanging="216"/>
+        <w:widowControl/>
       </w:pPr>
       <w:r>
-        <w:t>View and find employees using a searchable, paginated employee list.</w:t>
+        <w:rPr>
+          <w:b/>
+        </w:rPr>
+        <w:t xml:space="preserve">Employee and salary records. </w:t>
+      </w:r>
+      <w:r>
+        <w:t>Seed 10,000 fictional employees. Track employee ID, name, country, department and status. For this assessment, salary means annual base pay in one ISO currency with an effective date; retain each change with its prior value, actor and timestamp.</w:t>
       </w:r>
     </w:p>
     <w:p>
       <w:pPr>
         <w:pStyle w:val="ListBullet"/>
-        <w:ind w:left="360" w:hanging="216"/>
+        <w:widowControl/>
       </w:pPr>
       <w:r>
-        <w:t>View an employee’s salary details and update them, subject to the confirmed rules for salary changes.</w:t>
+        <w:rPr>
+          <w:b/>
+        </w:rPr>
+        <w:t xml:space="preserve">HR workflows. </w:t>
+      </w:r>
+      <w:r>
+        <w:t>Provide searchable, filterable, server-paginated employee records, salary details and validated salary updates.</w:t>
       </w:r>
     </w:p>
     <w:p>
       <w:pPr>
         <w:pStyle w:val="ListBullet"/>
-        <w:ind w:left="360" w:hanging="216"/>
+        <w:widowControl/>
       </w:pPr>
       <w:r>
-        <w:t>Filter or group salary information using the dimensions confirmed by Incubyte, such as country, currency, or department.</w:t>
+        <w:rPr>
+          <w:b/>
+        </w:rPr>
+        <w:t xml:space="preserve">Authentication. </w:t>
+      </w:r>
+      <w:r>
+        <w:t>Use OAuth 2.0 / OpenID Connect Authorization Code with PKCE and JWT access tokens, with a single HR_MANAGER role and a seeded demo identity. Production SSO, user administration and fine-grained role management are out of scope.</w:t>
       </w:r>
     </w:p>
     <w:p>
       <w:pPr>
         <w:pStyle w:val="ListBullet"/>
-        <w:ind w:left="360" w:hanging="216"/>
+        <w:widowControl/>
       </w:pPr>
       <w:r>
-        <w:t>Show clear totals or summaries only where values can be compared meaningfully; do not combine different currencies as if they were equivalent.</w:t>
+        <w:rPr>
+          <w:b/>
+        </w:rPr>
+        <w:t xml:space="preserve">Pay insights. </w:t>
       </w:r>
-    </w:p>
-    <w:p>
-      <w:pPr>
-        <w:pStyle w:val="ListBullet"/>
-        <w:ind w:left="360" w:hanging="216"/>
-      </w:pPr>
       <w:r>
-        <w:t>Seed the application with 10,000 representative employees so the core workflows can be demonstrated at the intended scale.</w:t>
+        <w:t>Provide employee counts and minimum, average and maximum annual base pay grouped by country, department and currency, with filters.</w:t>
       </w:r>
     </w:p>
     <w:p>
       <w:pPr>
         <w:pStyle w:val="Heading1"/>
+        <w:widowControl/>
       </w:pPr>
       <w:r>
-        <w:t>3. Deliberately Out of Scope for the First Version</w:t>
+        <w:t>How the application answers pay questions</w:t>
       </w:r>
     </w:p>
     <w:p>
       <w:pPr>
-        <w:pStyle w:val="ListBullet"/>
-        <w:ind w:left="360" w:hanging="216"/>
+        <w:widowControl/>
       </w:pPr>
       <w:r>
-        <w:rPr>
-          <w:b/>
-        </w:rPr>
-        <w:t xml:space="preserve">Payroll calculation, payslips, tax, benefits, or payment processing: </w:t>
-      </w:r>
-      <w:r>
-        <w:t>the stated need is managing and understanding salary data.</w:t>
-      </w:r>
-    </w:p>
-    <w:p>
-      <w:pPr>
-        <w:pStyle w:val="ListBullet"/>
-        <w:ind w:left="360" w:hanging="216"/>
-      </w:pPr>
-      <w:r>
-        <w:rPr>
-          <w:b/>
-        </w:rPr>
-        <w:t xml:space="preserve">Employee self-service and role or permission administration: </w:t>
-      </w:r>
-      <w:r>
-        <w:t>the assessment names the HR Manager as the user; access-control expectations need clarification.</w:t>
-      </w:r>
-    </w:p>
-    <w:p>
-      <w:pPr>
-        <w:pStyle w:val="ListBullet"/>
-        <w:ind w:left="360" w:hanging="216"/>
-      </w:pPr>
-      <w:r>
-        <w:rPr>
-          <w:b/>
-        </w:rPr>
-        <w:t xml:space="preserve">Currency conversion and exchange-rate reporting: </w:t>
-      </w:r>
-      <w:r>
-        <w:t>no conversion rules or source are specified.</w:t>
-      </w:r>
-    </w:p>
-    <w:p>
-      <w:pPr>
-        <w:pStyle w:val="ListBullet"/>
-        <w:ind w:left="360" w:hanging="216"/>
-      </w:pPr>
-      <w:r>
-        <w:rPr>
-          <w:b/>
-        </w:rPr>
-        <w:t xml:space="preserve">Bulk spreadsheet import/export: </w:t>
-      </w:r>
-      <w:r>
-        <w:t>spreadsheets are the current process, but import/export behavior and validation rules are not specified.</w:t>
-      </w:r>
-    </w:p>
-    <w:p>
-      <w:pPr>
-        <w:pStyle w:val="ListBullet"/>
-        <w:ind w:left="360" w:hanging="216"/>
-      </w:pPr>
-      <w:r>
-        <w:rPr>
-          <w:b/>
-        </w:rPr>
-        <w:t xml:space="preserve">Advanced analytics beyond agreed salary summaries: </w:t>
-      </w:r>
-      <w:r>
-        <w:t>the questions HR needs to answer are not yet defined.</w:t>
+        <w:t>Use a reporting view with supported metrics, groupings and filters backed by database aggregation endpoints. Every result shows its currency; values in different currencies are never combined. Spring AI and free-form chat are not in the first version: deterministic results are easier to verify and audit, and the assessment does not require natural-language chat. If chat is added later, an LLM should call restricted aggregation tools and receive summarized results, never all 10,000 salary rows.</w:t>
       </w:r>
     </w:p>
     <w:p>
       <w:pPr>
         <w:pStyle w:val="Heading1"/>
+        <w:widowControl/>
       </w:pPr>
       <w:r>
-        <w:t>4. Clarifications for Incubyte</w:t>
+        <w:t>Out of scope and rationale</w:t>
       </w:r>
     </w:p>
     <w:p>
       <w:pPr>
-        <w:pStyle w:val="ListNumber"/>
-        <w:ind w:left="403" w:hanging="259"/>
+        <w:widowControl/>
       </w:pPr>
       <w:r>
-        <w:t>Which employee fields are required, and which fields should HR be able to search, filter, or sort by?</w:t>
-      </w:r>
-    </w:p>
-    <w:p>
-      <w:pPr>
-        <w:pStyle w:val="ListNumber"/>
-        <w:ind w:left="403" w:hanging="259"/>
-      </w:pPr>
-      <w:r>
-        <w:t>What does a salary consist of: base salary only, or also bonus, allowances, pay frequency, and effective date?</w:t>
-      </w:r>
-    </w:p>
-    <w:p>
-      <w:pPr>
-        <w:pStyle w:val="ListNumber"/>
-        <w:ind w:left="403" w:hanging="259"/>
-      </w:pPr>
-      <w:r>
-        <w:t>Should the system retain salary change history, including who changed the salary and when?</w:t>
-      </w:r>
-    </w:p>
-    <w:p>
-      <w:pPr>
-        <w:pStyle w:val="ListNumber"/>
-        <w:ind w:left="403" w:hanging="259"/>
-      </w:pPr>
-      <w:r>
-        <w:t>Which currencies and countries should the sample data support? Should reports stay separated by currency, or is conversion expected?</w:t>
-      </w:r>
-    </w:p>
-    <w:p>
-      <w:pPr>
-        <w:pStyle w:val="ListNumber"/>
-        <w:ind w:left="403" w:hanging="259"/>
-      </w:pPr>
-      <w:r>
-        <w:t>What specific questions should the application answer about how the organization pays people? For example, average salary by country or salary ranges by department?</w:t>
-      </w:r>
-    </w:p>
-    <w:p>
-      <w:pPr>
-        <w:pStyle w:val="ListNumber"/>
-        <w:ind w:left="403" w:hanging="259"/>
-      </w:pPr>
-      <w:r>
-        <w:t>Should HR be able to add, edit, and deactivate employees, or only manage salary data for a fixed employee list?</w:t>
-      </w:r>
-    </w:p>
-    <w:p>
-      <w:pPr>
-        <w:pStyle w:val="ListNumber"/>
-        <w:ind w:left="403" w:hanging="259"/>
-      </w:pPr>
-      <w:r>
-        <w:t>Are authentication, authorization, audit logs, or approval workflows expected in this assessment?</w:t>
-      </w:r>
-    </w:p>
-    <w:p>
-      <w:pPr>
-        <w:pStyle w:val="ListNumber"/>
-        <w:ind w:left="403" w:hanging="259"/>
-      </w:pPr>
-      <w:r>
-        <w:t>Is spreadsheet import/export required, or is seeded data plus in-app editing sufficient?</w:t>
-      </w:r>
-    </w:p>
-    <w:p>
-      <w:pPr>
-        <w:pStyle w:val="ListNumber"/>
-        <w:ind w:left="403" w:hanging="259"/>
-      </w:pPr>
-      <w:r>
-        <w:t>Are there deployment or demo requirements beyond a publicly accessible application and a video walkthrough?</w:t>
+        <w:t>Payroll execution, tax or benefits calculations, exchange-rate conversion, approvals, employee self-service and spreadsheet import/export are excluded because their rules and workflows are unspecified and are not needed to demonstrate salary management and pay insights.</w:t>
       </w:r>
     </w:p>
     <w:p>
       <w:pPr>
         <w:pStyle w:val="Heading1"/>
+        <w:widowControl/>
       </w:pPr>
       <w:r>
-        <w:t>5. Proposed Technical Direction</w:t>
+        <w:t>Technical direction and quality</w:t>
       </w:r>
     </w:p>
     <w:p>
+      <w:pPr>
+        <w:widowControl/>
+      </w:pPr>
       <w:r>
-        <w:t>Use Java for the backend, Angular for the UI, and a relational database, subject to any repository or deployment constraints. Design list and summary operations for 10,000 employees using server-side filtering and pagination. Include focused automated tests for salary rules and core workflows.</w:t>
+        <w:t>Use Angular, Java with Spring Boot and a relational database. Apply server-side pagination and filtering for employee lists, and focused deterministic tests for salary validation, history, access control and analytics. Deploy the application and provide a short workflow demo.</w:t>
       </w:r>
     </w:p>
-    <w:tbl>
-      <w:tblPr>
-        <w:tblW w:type="auto" w:w="0"/>
-        <w:jc w:val="center"/>
-        <w:tblLook w:firstColumn="1" w:firstRow="1" w:lastColumn="0" w:lastRow="0" w:noHBand="0" w:noVBand="1" w:val="04A0"/>
-      </w:tblPr>
-      <w:tblGrid>
-        <w:gridCol w:w="9936"/>
-      </w:tblGrid>
-      <w:tr>
-        <w:tc>
-          <w:tcPr>
-            <w:tcW w:type="dxa" w:w="9936"/>
-            <w:shd w:fill="FFF4DB"/>
-            <w:tcBorders>
-              <w:top w:val="single" w:sz="6" w:color="E5C77A"/>
-              <w:left w:val="single" w:sz="6" w:color="E5C77A"/>
-              <w:bottom w:val="single" w:sz="6" w:color="E5C77A"/>
-              <w:right w:val="single" w:sz="6" w:color="E5C77A"/>
-            </w:tcBorders>
-          </w:tcPr>
-          <w:p>
-            <w:pPr>
-              <w:spacing w:after="40"/>
-            </w:pPr>
-            <w:r>
-              <w:rPr>
-                <w:rFonts w:ascii="Aptos" w:hAnsi="Aptos"/>
-                <w:sz w:val="20"/>
-              </w:rPr>
-            </w:r>
-            <w:r>
-              <w:rPr>
-                <w:rFonts w:ascii="Aptos" w:hAnsi="Aptos"/>
-                <w:b/>
-                <w:color w:val="825A14"/>
-                <w:sz w:val="20"/>
-              </w:rPr>
-              <w:t xml:space="preserve">Pending: </w:t>
-            </w:r>
-            <w:r>
-              <w:rPr>
-                <w:rFonts w:ascii="Aptos" w:hAnsi="Aptos"/>
-                <w:sz w:val="20"/>
-              </w:rPr>
-              <w:t>Confirm answers to the clarification questions, then finalize scope and acceptance criteria before implementation.</w:t>
-            </w:r>
-          </w:p>
-        </w:tc>
-      </w:tr>
-    </w:tbl>
     <w:sectPr>
       <w:headerReference w:type="default" r:id="rId9"/>
       <w:footerReference w:type="default" r:id="rId10"/>
       <w:pgSz w:w="12240" w:h="15840"/>
-      <w:pgMar w:top="1008" w:right="1152" w:bottom="1008" w:left="1152" w:header="720" w:footer="720" w:gutter="0"/>
+      <w:pgMar w:top="749" w:right="893" w:bottom="749" w:left="893" w:header="720" w:footer="720" w:gutter="0"/>
       <w:cols w:space="720"/>
       <w:docGrid w:linePitch="360"/>
     </w:sectPr>
@@ -840,12 +580,12 @@
     <w:qFormat/>
     <w:rsid w:val="00FC693F"/>
     <w:pPr>
-      <w:spacing w:after="100"/>
+      <w:spacing w:after="50" w:line="240" w:lineRule="auto"/>
     </w:pPr>
     <w:rPr>
-      <w:rFonts w:ascii="Aptos" w:hAnsi="Aptos"/>
-      <w:color w:val="2D3741"/>
-      <w:sz w:val="20"/>
+      <w:rFonts w:ascii="Arial" w:hAnsi="Arial"/>
+      <w:color w:val="232323"/>
+      <w:sz w:val="18"/>
     </w:rPr>
   </w:style>
   <w:style w:type="paragraph" w:styleId="Header">
@@ -903,15 +643,15 @@
     <w:pPr>
       <w:keepNext/>
       <w:keepLines/>
-      <w:spacing w:before="240" w:after="100"/>
+      <w:spacing w:before="100" w:after="30"/>
       <w:outlineLvl w:val="0"/>
     </w:pPr>
     <w:rPr>
-      <w:rFonts w:asciiTheme="majorHAnsi" w:eastAsiaTheme="majorEastAsia" w:hAnsiTheme="majorHAnsi" w:cstheme="majorBidi" w:ascii="Aptos Display" w:hAnsi="Aptos Display"/>
+      <w:rFonts w:asciiTheme="majorHAnsi" w:eastAsiaTheme="majorEastAsia" w:hAnsiTheme="majorHAnsi" w:cstheme="majorBidi" w:ascii="Arial" w:hAnsi="Arial"/>
       <w:b/>
       <w:bCs/>
       <w:color w:val="1F4E79"/>
-      <w:sz w:val="30"/>
+      <w:sz w:val="21"/>
       <w:szCs w:val="28"/>
     </w:rPr>
   </w:style>
@@ -1192,16 +932,16 @@
       <w:pBdr>
         <w:bottom w:val="single" w:sz="8" w:space="4" w:color="4F81BD" w:themeColor="accent1"/>
       </w:pBdr>
-      <w:spacing w:after="100" w:line="240" w:lineRule="auto" w:before="0"/>
+      <w:spacing w:after="20" w:line="240" w:lineRule="auto" w:before="0"/>
       <w:contextualSpacing/>
     </w:pPr>
     <w:rPr>
-      <w:rFonts w:asciiTheme="majorHAnsi" w:eastAsiaTheme="majorEastAsia" w:hAnsiTheme="majorHAnsi" w:cstheme="majorBidi" w:ascii="Aptos Display" w:hAnsi="Aptos Display"/>
+      <w:rFonts w:asciiTheme="majorHAnsi" w:eastAsiaTheme="majorEastAsia" w:hAnsiTheme="majorHAnsi" w:cstheme="majorBidi" w:ascii="Arial" w:hAnsi="Arial"/>
       <w:b/>
-      <w:color w:val="1F4E79"/>
+      <w:color w:val="000000"/>
       <w:spacing w:val="5"/>
       <w:kern w:val="28"/>
-      <w:sz w:val="50"/>
+      <w:sz w:val="36"/>
       <w:szCs w:val="52"/>
     </w:rPr>
   </w:style>
@@ -1375,8 +1115,14 @@
       <w:numPr>
         <w:numId w:val="1"/>
       </w:numPr>
+      <w:spacing w:after="30" w:line="240" w:lineRule="auto"/>
+      <w:ind w:left="317" w:hanging="173"/>
       <w:contextualSpacing/>
     </w:pPr>
+    <w:rPr>
+      <w:rFonts w:ascii="Arial" w:hAnsi="Arial"/>
+      <w:sz w:val="18"/>
+    </w:rPr>
   </w:style>
   <w:style w:type="paragraph" w:styleId="ListBullet2">
     <w:name w:val="List Bullet 2"/>

</xml_diff>